<commit_message>
Archaic words: keep media monitoring to 4 words, restore real test data
Hypothesis is now checked against the complete dictionary data and the
test; the generation comparison waits for all 18 participants. Test
values outside 0/1/2 are rejected in Excel and flagged in red, and
printable forms are generated for the participants still to be asked.

Co-Authored-By: Claude Opus 5.5 <noreply@anthropic.com>
Claude-Session: https://claude.ai/code/session_01GWp2V469ega9rMmDw4DHEN
</commit_message>
<xml_diff>
--- a/Zerde_Konergen_sozder/Zertteu_kundeligi.docx
+++ b/Zerde_Konergen_sozder/Zertteu_kundeligi.docx
@@ -1522,7 +1522,7 @@
                 <w:sz w:val="22"/>
                 <w:szCs w:val="22"/>
               </w:rPr>
-              <w:t xml:space="preserve">Сөздерді egemen.kz сайтынан соңғы бір жыл бойынша іздеп, нәтиже санын және ең жаңа мысалды жаздым</w:t>
+              <w:t xml:space="preserve">Әскери топтағы 4 сөзді egemen.kz сайтынан соңғы бір жыл бойынша іздеп, нәтиже санын және ең жаңа мысалды жаздым</w:t>
             </w:r>
           </w:p>
         </w:tc>
@@ -2254,7 +2254,7 @@
                 <w:sz w:val="22"/>
                 <w:szCs w:val="22"/>
               </w:rPr>
-              <w:t xml:space="preserve">Әр сөздің мәртебесін анықтадым, кестелер мен диаграммалар жасадым, болжамды тексердім</w:t>
+              <w:t xml:space="preserve">Кестелер мен диаграммалар жасадым, сөздік, баспасөз және тест нәтижелерін салыстырып, болжамды тексердім</w:t>
             </w:r>
           </w:p>
         </w:tc>
@@ -2288,7 +2288,7 @@
                 <w:sz w:val="22"/>
                 <w:szCs w:val="22"/>
               </w:rPr>
-              <w:t xml:space="preserve">4–6-кестелер, 4–7-суреттер</w:t>
+              <w:t xml:space="preserve">4–5-кестелер, 4–5-суреттер</w:t>
             </w:r>
           </w:p>
         </w:tc>
@@ -2498,7 +2498,7 @@
                 <w:sz w:val="22"/>
                 <w:szCs w:val="22"/>
               </w:rPr>
-              <w:t xml:space="preserve">36 сөзге «сөз паспортын» жасадым: мағынасы, түрі, мәртебесі, бүгінгі мысалы</w:t>
+              <w:t xml:space="preserve">36 сөзге «сөз паспортын» жасадым: мағынасы, түрі, сөздіктегі белгісі, бүгінгі мысалы</w:t>
             </w:r>
           </w:p>
         </w:tc>

</xml_diff>